<commit_message>
docs: detail SEIUE token setup and secure disconnect
</commit_message>
<xml_diff>
--- a/jackyun-portal/docs/SEIUE-Schedule-3.40.0-20261023.docx
+++ b/jackyun-portal/docs/SEIUE-Schedule-3.40.0-20261023.docx
@@ -1,6 +1,6 @@
 
 <file path=word/document.xml><?xml version="1.0" encoding="utf-8"?>
-<w:document xmlns:wpc="http://schemas.microsoft.com/office/word/2010/wordprocessingCanvas" xmlns:mo="http://schemas.microsoft.com/office/mac/office/2008/main" xmlns:mc="http://schemas.openxmlformats.org/markup-compatibility/2006" xmlns:mv="urn:schemas-microsoft-com:mac:vml" xmlns:o="urn:schemas-microsoft-com:office:office" xmlns:r="http://schemas.openxmlformats.org/officeDocument/2006/relationships" xmlns:m="http://schemas.openxmlformats.org/officeDocument/2006/math" xmlns:v="urn:schemas-microsoft-com:vml" xmlns:wp14="http://schemas.microsoft.com/office/word/2010/wordprocessingDrawing" xmlns:wp="http://schemas.openxmlformats.org/drawingml/2006/wordprocessingDrawing" xmlns:w10="urn:schemas-microsoft-com:office:word" xmlns:w="http://schemas.openxmlformats.org/wordprocessingml/2006/main" xmlns:w14="http://schemas.microsoft.com/office/word/2010/wordml" xmlns:wpg="http://schemas.microsoft.com/office/word/2010/wordprocessingGroup" xmlns:wpi="http://schemas.microsoft.com/office/word/2010/wordprocessingInk" xmlns:wne="http://schemas.microsoft.com/office/word/2006/wordml" xmlns:wps="http://schemas.microsoft.com/office/word/2010/wordprocessingShape" mc:Ignorable="w14 wp14">
+<w:document xmlns:ns1="http://schemas.openxmlformats.org/markup-compatibility/2006" xmlns:ns2="http://schemas.openxmlformats.org/officeDocument/2006/relationships" xmlns:w="http://schemas.openxmlformats.org/wordprocessingml/2006/main" ns1:Ignorable="w14 wp14">
   <w:body>
     <w:p>
       <w:pPr>
@@ -1080,7 +1080,7 @@
                 <w:color w:val="536575"/>
                 <w:sz w:val="16"/>
               </w:rPr>
-              <w:t>合成数据单元测试</w:t>
+              <w:t>SEIUE 数据与路由回归</w:t>
             </w:r>
           </w:p>
         </w:tc>
@@ -1092,7 +1092,7 @@
           </w:tcPr>
           <w:p>
             <w:r>
-              <w:t>16 项通过。</w:t>
+              <w:t>19 项通过。</w:t>
             </w:r>
           </w:p>
         </w:tc>
@@ -1114,7 +1114,7 @@
                 <w:color w:val="536575"/>
                 <w:sz w:val="16"/>
               </w:rPr>
-              <w:t>含严格日期、时区、课程字段、Draft.js、分页合并、重复 ID、待办状态、校历隔离和 URL 白名单。</w:t>
+              <w:t>含课程/待办映射、严格日期与时区、分页和重复处理、校历隔离、上游错误、未授权和跨用户路由安全，以及版本更新历史。</w:t>
             </w:r>
           </w:p>
         </w:tc>
@@ -1467,7 +1467,7 @@
           </w:tcPr>
           <w:p>
             <w:r>
-              <w:t>Edge/Playwright 浏览器打印预览，3 页均已目视检查。</w:t>
+              <w:t>docx-preview 浏览器预览，3 页均已目视检查。</w:t>
             </w:r>
           </w:p>
         </w:tc>
@@ -1554,13 +1554,13 @@
         <w:pStyle w:val="Heading1"/>
       </w:pPr>
       <w:r>
-        <w:t>8. 学生如何安全获取 Token</w:t>
+        <w:t xml:space="preserve">8. 学生如何安全获取 Token</w:t>
       </w:r>
     </w:p>
     <w:p>
       <w:pPr/>
       <w:r>
-        <w:t>目前需由学生在已登录的 SEIUE 学校网站中取得短期 Bearer Token；JackYun 不替用户登录。学校界面和浏览器开发者工具显示可能因浏览器版本不同而略有差异。</w:t>
+        <w:t xml:space="preserve">准备：使用电脑上的 Chrome 或 Edge，打开学校日常使用的 HTTPS SEIUE 网站，只在学校官方登录页正常登录；进入学生身份下的个人课表。JackYun 不需要也不会索取学校密码。</w:t>
       </w:r>
     </w:p>
     <w:p>
@@ -1568,7 +1568,7 @@
         <w:pStyle w:val="ListNumber"/>
       </w:pPr>
       <w:r>
-        <w:t>在新标签页正常登录自己的 SEIUE 学校网站并打开个人课表。</w:t>
+        <w:t xml:space="preserve">步骤一：打开开发者工具。按 F12（部分笔记本需 Fn+F12），或按 Ctrl+Shift+I；切换到 Network（网络）并选择 Fetch/XHR（获取/XHR）。点击清除记录按钮，再保持该面板打开刷新课表。</w:t>
       </w:r>
     </w:p>
     <w:p>
@@ -1576,7 +1576,7 @@
         <w:pStyle w:val="ListNumber"/>
       </w:pPr>
       <w:r>
-        <w:t>按 F12 打开开发者工具，选 Network（网络），刷新课表；筛选 api.seiue.com，打开一条状态 200、GET 路径包含 /chalk/calendar/personals/…/events 的请求。</w:t>
+        <w:t xml:space="preserve">步骤二：定位课程请求。在 Network 过滤框输入 api.seiue.com，找到状态码 200、方法 GET、路径类似 /chalk/calendar/personals/{Reflection ID}/events 的请求并点开。没有请求时，先确认面板在刷新前打开，再回到学生身份重新打开个人课表。</w:t>
       </w:r>
     </w:p>
     <w:p>
@@ -1584,7 +1584,7 @@
         <w:pStyle w:val="ListNumber"/>
       </w:pPr>
       <w:r>
-        <w:t>在 Request Headers 中只抄取 Authorization 的 Bearer 后半段、X-Reflection-Id 和 X-School-Id。学校网址填写地址栏里的学校 SEIUE 前端网址；学生角色由 JackYun 自动指定。</w:t>
+        <w:t xml:space="preserve">步骤三：在请求详情的 Headers（标头）→ Request Headers（请求标头）中分别查看 Authorization、X-Reflection-Id、X-School-Id。Authorization 以 Bearer 开头，Token 输入框只粘贴 Bearer 后面的值，不要带 Bearer 前缀。Reflection ID 和 School ID 粘贴到同名字段；若请求头没有 Reflection ID，可从 events 请求路径中 personals/ 与 /events 之间读取。三个值必须来自同一个成功请求。</w:t>
       </w:r>
     </w:p>
     <w:p>
@@ -1592,7 +1592,7 @@
         <w:pStyle w:val="ListNumber"/>
       </w:pPr>
       <w:r>
-        <w:t>只把上述三个值分别贴进 JackYun 的 Token、Reflection ID、School ID 字段。不要导出 HAR、使用“复制为 cURL”、复制全部请求标头或把请求截图/内容贴进聊天。</w:t>
+        <w:t xml:space="preserve">步骤四：SEIUE 学校网址填写浏览器地址栏的学校站点地址，不要填 api.seiue.com；学生角色由 JackYun 固定。核对仅填了 Token、Reflection ID 和 School ID 后，点击“验证并关联 SEIUE”。验证成功后 Token 输入框会清空，再到 SCHEDULE 切换周检查课程。</w:t>
       </w:r>
     </w:p>
     <w:p>
@@ -1600,13 +1600,13 @@
         <w:pStyle w:val="ListNumber"/>
       </w:pPr>
       <w:r>
-        <w:t>Token 最长保存 24 小时。到期后在仍登录的 SEIUE 页面重新选取一条成功请求，复制新的 Bearer 值并在 JackYun 账户关联中续期。</w:t>
+        <w:t xml:space="preserve">安全核对：不要导出 HAR、不要复制为 cURL、不要复制所有请求标头，也不要分享 Token、Cookie、学校密码、请求详情截图或原始响应，包括发到支持聊天。完成后清除 Network 记录并关闭开发者工具。Token 通过 HTTPS 发送到 JackYun 服务端，以 AES-256-GCM 加密保存，最多 24 小时，不写入浏览器存储。</w:t>
       </w:r>
     </w:p>
     <w:p>
       <w:pPr/>
       <w:r>
-        <w:t>自动获取与自动续期仍关闭：研究未发现官方 refresh token；登录换取 Token 的流程需向 SEIUE Passport 提交学校密码。让 JackYun 接收密码或浏览器 Cookie 会扩大凭据暴露面，因此当前只采用用户在浏览器中自行取得短期 Token 的方式。</w:t>
+        <w:t xml:space="preserve">续期：Token 最长保存 24 小时。到期后回 SEIUE 正常登录并重复上述步骤，从新的 200 请求复制 Token，粘贴到学生 Token 输入框，再点已关联账户旁的“粘贴新 Token 并续期”。若学校或学生身份变化，解除关联后重新关联。列表没有 200 请求时检查 Fetch/XHR 筛选；提示 401 时取最新 Token，提示 403 时核对学生身份及三个值是否来自同一个请求。</w:t>
       </w:r>
     </w:p>
     <w:p>
@@ -1616,7 +1616,7 @@
         <w:spacing w:before="220" w:after="80"/>
       </w:pPr>
       <w:r>
-        <w:t>参考依据</w:t>
+        <w:t xml:space="preserve">自动获取/续期保持关闭：目前研究未找到 SEIUE 官方支持的 refresh token；自动登录换取 Token 需要向认证服务提交学校密码。为了避免扩大凭据暴露面，当前只使用用户手动从已登录浏览器复制短期 Token 的方式。</w:t>
       </w:r>
     </w:p>
     <w:p>
@@ -1628,7 +1628,7 @@
       </w:r>
     </w:p>
     <w:sectPr>
-      <w:footerReference w:type="default" r:id="rId9"/>
+      <w:footerReference w:type="default" ns2:id="rId9"/>
       <w:pgSz w:w="12240" w:h="15840"/>
       <w:pgMar w:top="979" w:right="1123" w:bottom="979" w:left="1123" w:header="720" w:footer="720" w:gutter="0"/>
       <w:cols w:space="720"/>
@@ -1639,7 +1639,7 @@
 </file>
 
 <file path=word/footer1.xml><?xml version="1.0" encoding="utf-8"?>
-<w:ftr xmlns:m="http://schemas.openxmlformats.org/officeDocument/2006/math" xmlns:mc="http://schemas.openxmlformats.org/markup-compatibility/2006" xmlns:mo="http://schemas.microsoft.com/office/mac/office/2008/main" xmlns:mv="urn:schemas-microsoft-com:mac:vml" xmlns:o="urn:schemas-microsoft-com:office:office" xmlns:r="http://schemas.openxmlformats.org/officeDocument/2006/relationships" xmlns:v="urn:schemas-microsoft-com:vml" xmlns:w10="urn:schemas-microsoft-com:office:word" xmlns:w14="http://schemas.microsoft.com/office/word/2010/wordml" xmlns:w="http://schemas.openxmlformats.org/wordprocessingml/2006/main" xmlns:wne="http://schemas.microsoft.com/office/word/2006/wordml" xmlns:wp14="http://schemas.microsoft.com/office/word/2010/wordprocessingDrawing" xmlns:wp="http://schemas.openxmlformats.org/drawingml/2006/wordprocessingDrawing" xmlns:wpc="http://schemas.microsoft.com/office/word/2010/wordprocessingCanvas" xmlns:wpg="http://schemas.microsoft.com/office/word/2010/wordprocessingGroup" xmlns:wpi="http://schemas.microsoft.com/office/word/2010/wordprocessingInk" xmlns:wps="http://schemas.microsoft.com/office/word/2010/wordprocessingShape" mc:Ignorable="w14 wp14">
+<w:ftr xmlns:ns1="http://schemas.openxmlformats.org/markup-compatibility/2006" xmlns:w="http://schemas.openxmlformats.org/wordprocessingml/2006/main" ns1:Ignorable="w14 wp14">
   <w:p>
     <w:pPr>
       <w:pStyle w:val="Footer"/>
@@ -1650,7 +1650,7 @@
         <w:color w:val="71808C"/>
         <w:sz w:val="16"/>
       </w:rPr>
-      <w:t xml:space="preserve">JackYun 3.39.0  |  </w:t>
+      <w:t xml:space="preserve">JackYun 3.40.0  |  </w:t>
     </w:r>
     <w:fldSimple w:instr="PAGE"/>
   </w:p>

</xml_diff>